<commit_message>
Book 7: explain stack-up impedance answer
</commit_message>
<xml_diff>
--- a/EE - SERIES/Packaging_Layout_EMC_and_Test_Book7.docx
+++ b/EE - SERIES/Packaging_Layout_EMC_and_Test_Book7.docx
@@ -23582,9 +23582,9 @@
       </w:r>
       <w:r>
         <w:rPr>
-          <w:i w:val="0"/>
-        </w:rPr>
-        <w:t>It falls.</w:t>
+          <w:b w:val="0"/>
+        </w:rPr>
+        <w:t>With the dielectric constant and other dimensions fixed, a wider trace increases 0.8w + t in the formula's denominator. That reduces the logarithm and the estimated characteristic impedance.</w:t>
       </w:r>
     </w:p>
     <w:p>

</xml_diff>

<commit_message>
Book 7: streamline chamber and surge guidance
</commit_message>
<xml_diff>
--- a/EE - SERIES/Packaging_Layout_EMC_and_Test_Book7.docx
+++ b/EE - SERIES/Packaging_Layout_EMC_and_Test_Book7.docx
@@ -18509,10 +18509,13 @@
     <w:p>
       <w:pPr/>
       <w:r>
-        <w:rPr>
-          <w:i w:val="0"/>
-        </w:rPr>
-        <w:t>Above 1 GHz the reflecting floor stops being an advantage. The ground-reflected ray produces deep nulls that move with small changes in height, and CISPR 16-1-4 therefore requires a free-space test environment: absorber is laid on the floor between the antenna and the product, turning the semi-anechoic chamber into a fully anechoic one for these frequencies. The site is validated by a site voltage standing-wave ratio measurement, S_VSWR, which must not exceed 6 dB across the test volume. The receive antenna is now a horn, and its beam must cover the product. At distance d, a horn with a 3 dB beamwidth θ illuminates a width w = 2d tan(θ/2). Horn beamwidth narrows as frequency rises, so a product that is fully covered at 1 GHz may extend outside the beam at 6 GHz, and the standard then requires the antenna to be scanned in height to find the maximum. The horn's own far field, 2D²/λ, must also lie inside the test distance: a horn with a 0.2 m aperture at 6 GHz has 2 × 0.04 / 0.05 = 1.6 m, comfortably less than 3 m.</w:t>
+        <w:t>Above 1 GHz, floor reflections create deep nulls that shift with small changes in height. CISPR 16-1-4 therefore uses a free-space environment: floor absorber between the antenna and product turns a semi-anechoic chamber into a fully anechoic one. Validate the site using its voltage standing-wave ratio, S_VSWR, which must not exceed 6 dB across the test volume.</w:t>
+      </w:r>
+    </w:p>
+    <w:p>
+      <w:pPr/>
+      <w:r>
+        <w:t>Use a horn as the receive antenna and make sure its beam covers the product. At distance d, a horn with beamwidth angle beta illuminates a width w = 2d tan(beta/2). Because the beam narrows as frequency rises, a product covered at 1 GHz may extend beyond it at 6 GHz; the standard then requires a height scan to find the maximum. The horn far field, 2D^2/lambda, must also fit inside the test distance. For a 0.2 m aperture at 6 GHz, 2 x 0.2^2 / 0.05 = 1.6 m, within a 3 m test distance.</w:t>
       </w:r>
     </w:p>
     <w:p>
@@ -19941,10 +19944,7 @@
     <w:p>
       <w:pPr/>
       <w:r>
-        <w:rPr>
-          <w:i w:val="0"/>
-        </w:rPr>
-        <w:t>Surges on signal and data lines are applied through a larger coupling impedance than on mains lines. For unshielded lines IEC 61000-4-5 adds 40 Ω to the generator's 2 Ω, so the current is far smaller than on a power input, but the protected circuit is also far more fragile. A TVS diode conducts above its breakdown voltage V_BR and behaves, once conducting, roughly like a voltage source V_BR in series with a dynamic resistance R_dyn. The clamping voltage is then V_C = V_BR + I_PP R_dyn, and that voltage, not the breakdown voltage, is what the protected pin sees. Choosing a TVS means meeting four conditions at once: its stand-off voltage must exceed the line's highest working voltage so it does not leak in normal use; its clamping voltage at the surge current must stay below the protected part's absolute maximum; its peak pulse power rating for an 8/20 µs pulse must exceed V_C × I_PP; and its capacitance must be small enough not to load the signal, which for multi-gigabit lines means a fraction of a picofarad and a different class of device.</w:t>
+        <w:t>IEC 61000-4-5 applies signal and data line surges through a larger impedance than mains surges. For an unshielded line, the test adds 40 ohms to the generator's 2-ohm source impedance. This limits current relative to mains testing, but low-voltage signal pins remain vulnerable. Above breakdown voltage V_BR, a TVS behaves approximately like V_BR in series with its dynamic resistance R_dyn. At surge current I_PP, the protected pin sees V_C = V_BR + I_PP * R_dyn, not V_BR alone. A suitable TVS must pass four checks: its stand-off voltage must exceed the line's highest normal voltage; its clamping voltage must stay below the protected part's absolute maximum at the test current; its 8/20 us peak-pulse rating must exceed V_C * I_PP; and, on multi-gigabit lines, its capacitance must be low enough to avoid loading the signal, often a fraction of a picofarad.</w:t>
       </w:r>
     </w:p>
     <w:p>

</xml_diff>

<commit_message>
Book 7: split roofline model and example
</commit_message>
<xml_diff>
--- a/EE - SERIES/Packaging_Layout_EMC_and_Test_Book7.docx
+++ b/EE - SERIES/Packaging_Layout_EMC_and_Test_Book7.docx
@@ -785,10 +785,23 @@
     <w:p>
       <w:pPr/>
       <w:r>
-        <w:rPr>
-          <w:i w:val="0"/>
-        </w:rPr>
-        <w:t>A processor can be limited by how fast it computes or by how fast it is fed. The roofline model makes the choice explicit. Divide the peak arithmetic rate by the memory bandwidth and the result is the ridge point, in operations per byte: a workload that performs more operations than that for every byte it fetches is compute-bound, and one that performs fewer is bandwidth-bound and runs at the bandwidth times its arithmetic intensity, however many arithmetic units sit idle. A 2026 accelerator with about 2 × 10¹⁵ low-precision operations per second and 8 TB/s of HBM has a ridge at 250 operations per byte. Training large models, which reuses each weight across a large batch, sits above it. Generating text one token at a time for a single user, which reads every weight once per token for about two operations each, sits far below it, which is why the memory bandwidth of Chapter 17, and the packaging that delivers it, decides inference speed.</w:t>
+        <w:t>A processor can be limited by compute or by memory bandwidth. The roofline model compares the two. Divide the peak arithmetic rate by memory bandwidth to get the ridge point in operations per byte. Above the ridge, a workload is compute-bound. Below it, memory bandwidth sets performance: achievable operation rate is bandwidth multiplied by arithmetic intensity, even if some arithmetic units sit idle.</w:t>
+      </w:r>
+    </w:p>
+    <w:p>
+      <w:pPr>
+        <w:keepLines/>
+      </w:pPr>
+      <w:r>
+        <w:t>Consider a 2026 accelerator with about 2e15 low-precision operations per second and 8 TB/s of HBM. Its ridge point is 250 operations per byte. Large-batch training can reuse weights enough to sit above the ridge.</w:t>
+      </w:r>
+    </w:p>
+    <w:p>
+      <w:pPr>
+        <w:keepLines/>
+      </w:pPr>
+      <w:r>
+        <w:t>Single-user text generation often sits below it. The model reads weights and cached context for each generated token, with about two operations per weight read. HBM bandwidth and the package that delivers it then constrain inference speed; Chapter 17 covers the memory interface.</w:t>
       </w:r>
     </w:p>
     <w:p>

</xml_diff>

<commit_message>
Revise EE Book 7 after critical review
</commit_message>
<xml_diff>
--- a/EE - SERIES/Packaging_Layout_EMC_and_Test_Book7.docx
+++ b/EE - SERIES/Packaging_Layout_EMC_and_Test_Book7.docx
@@ -785,23 +785,10 @@
     <w:p>
       <w:pPr/>
       <w:r>
-        <w:t>A processor can be limited by compute or by memory bandwidth. The roofline model compares the two. Divide the peak arithmetic rate by memory bandwidth to get the ridge point in operations per byte. Above the ridge, a workload is compute-bound. Below it, memory bandwidth sets performance: achievable operation rate is bandwidth multiplied by arithmetic intensity, even if some arithmetic units sit idle.</w:t>
-      </w:r>
-    </w:p>
-    <w:p>
-      <w:pPr>
-        <w:keepLines/>
-      </w:pPr>
-      <w:r>
-        <w:t>Consider a 2026 accelerator with about 2e15 low-precision operations per second and 8 TB/s of HBM. Its ridge point is 250 operations per byte. Large-batch training can reuse weights enough to sit above the ridge.</w:t>
-      </w:r>
-    </w:p>
-    <w:p>
-      <w:pPr>
-        <w:keepLines/>
-      </w:pPr>
-      <w:r>
-        <w:t>Single-user text generation often sits below it. The model reads weights and cached context for each generated token, with about two operations per weight read. HBM bandwidth and the package that delivers it then constrain inference speed; Chapter 17 covers the memory interface.</w:t>
+        <w:rPr>
+          <w:i w:val="0"/>
+        </w:rPr>
+        <w:t>A processor can be limited by how fast it computes or by how fast it is fed. The roofline model makes the choice explicit. Divide the peak arithmetic rate by the memory bandwidth and the result is the ridge point, in operations per byte: a workload that performs more operations than that for every byte it fetches is compute-bound, and one that performs fewer is bandwidth-bound and runs at the bandwidth times its arithmetic intensity, however many arithmetic units sit idle. A 2026 accelerator with about 2 × 10¹⁵ low-precision operations per second and 8 TB/s of HBM has a ridge at 250 operations per byte. Training large models, which reuses each weight across a large batch, sits above it. Generating text one token at a time for a single user, which reads every weight once per token for about two operations each, sits far below it, which is why the memory bandwidth of Chapter 17, and the packaging that delivers it, decides inference speed.</w:t>
       </w:r>
     </w:p>
     <w:p>
@@ -17027,7 +17014,7 @@
         <w:rPr>
           <w:i w:val="0"/>
         </w:rPr>
-        <w:t>CISPR 16 is a family. Part 1-1 specifies the receiver; Part 1-4 the antennas and test sites; Part 2-1 conducted measurement; Part 2-3 radiated measurement; Part 4-2 measurement uncertainty. ANSI C63.4 specifies the US method for unintentional radiators and is what FCC Part 15 references. Both specify the same essentials: a test site validated by normalized site attenuation, an antenna scanned in height and both polarizations, a turntable rotated through 360°, the equipment under test arranged in a defined, repeatable way with its cables, and a receiver with defined detectors. A product standard picks a method and adds the limits.</w:t>
+        <w:t>CISPR 16 is a family. Part 1-1 specifies receivers; Part 1-2 coupling devices; Part 1-4 antennas and test sites; Part 2-1 conducted methods; Part 2-3 radiated methods; and Part 4-2 measurement uncertainty. ANSI/IEEE C63.4 is the US method standard for unintentional radiators, subject to the edition and procedure incorporated by the applicable FCC rule. The method and product standard must be read together.</w:t>
       </w:r>
     </w:p>
     <w:p>
@@ -17047,7 +17034,7 @@
         <w:rPr>
           <w:i w:val="0"/>
         </w:rPr>
-        <w:t>FCC Part 15 Subpart B divides unintentional radiators into Class A, for commercial and industrial use, and Class B, for residential use, which is stricter. Class B radiated limits at 3 m are 100 µV/m from 30 to 88 MHz, 150 µV/m from 88 to 216 MHz, 200 µV/m from 216 to 960 MHz, and 500 µV/m above 960 MHz, or 40.0, 43.5, 46.0, and 54.0 dBµV/m. Class A limits are specified at 10 m: 90, 150, 210, and 300 µV/m. CISPR 32 Class B, specified at 10 m with the quasi-peak detector, is 30 dBµV/m from 30 to 230 MHz and 37 dBµV/m from 230 to 1000 MHz; above 1 GHz, CISPR 32 uses peak and average limits at 3 m. Field strength in the far field falls as 1/r, so a limit at 10 m corresponds to one 20 log₁₀(10/3) = 10.5 dB higher at 3 m.</w:t>
+        <w:t>FCC Part 15 Subpart B divides unintentional radiators into Class A and Class B; Class B is generally the stricter limit set for residential environments. FCC Class B radiated limits at 3 m are 100 uV/m from 30 to 88 MHz, 150 uV/m from 88 to 216 MHz, 200 uV/m from 216 to 960 MHz, and 500 uV/m above 960 MHz: 40.0, 43.5, 46.0, and 54.0 dBuV/m. Class A limits are specified at 10 m: 90, 150, 210, and 300 uV/m. CISPR 32 Class B limits at 10 m are 30 dBuV/m from 30 to 230 MHz and 37 dBuV/m from 230 to 1000 MHz; the prescribed detector and distance depend on frequency and the applicable edition. Above 1 GHz, CISPR 32 uses separate peak and average limits. Converting a 10 m field-strength limit to 3 m by adding 10.5 dB is only a far-field approximation. It does not replace a standard's specified test distance or measurement procedure.</w:t>
       </w:r>
     </w:p>
     <w:p>
@@ -17282,7 +17269,7 @@
         <w:rPr>
           <w:i w:val="0"/>
         </w:rPr>
-        <w:t>Above 1 GHz the limits change form. The FCC Class B limit above 960 MHz is 500 µV/m at 3 m, which is 54 dBµV/m, measured with an average detector in a 1 MHz bandwidth, and a peak limit 20 dB higher, 74 dBµV/m, applies at the same time. CISPR 32 also sets separate average and peak limits above 1 GHz. How high the scan must go depends on the highest frequency generated or used inside the product, including clocks and processor cores. FCC Part 15 and CISPR 32 use nearly the same steps: if the highest internal frequency is below 108 MHz, scan to 1 GHz; below 500 MHz, to 2 GHz; below 1 GHz, to 5 GHz; above 1 GHz, to five times that frequency, which the FCC caps at 40 GHz and CISPR 32 at 6 GHz. A product with a fast processor therefore needs horn antennas and a test well into the microwave range, and its report must state the highest internal frequency it declared.</w:t>
+        <w:t>Above 1 GHz, the limits and detectors change. Under FCC 47 CFR 15.109, the Class B average limit above 960 MHz is 500 uV/m at 3 m (54 dBuV/m), with a peak limit 20 dB higher; Section 15.35 specifies the applicable bandwidth and detector provisions. CISPR 32 also sets separate average and peak limits above 1 GHz. The required scan range depends on the highest frequency generated or used in the device. FCC Section 15.33 includes a special case: when that frequency is below 1.705 MHz, scan to 30 MHz; otherwise, the upper range is 1 GHz below 108 MHz, 2 GHz from 108 to below 500 MHz, 5 GHz from 500 MHz to below 1 GHz, and five times the highest frequency above 1 GHz, capped at 40 GHz. CISPR 32 has its own scan-range table and cap; do not substitute the FCC table for it. Intentional radiators also have separate requirements. Record the rule, product standard, edition, and declared highest frequency used for the test.</w:t>
       </w:r>
     </w:p>
     <w:p>
@@ -17651,22 +17638,22 @@
         <w:rPr>
           <w:i w:val="0"/>
         </w:rPr>
-        <w:t>The peak detector follows the envelope's maximum and is the fastest to measure. The average detector reports the envelope's average. The quasi-peak detector charges quickly and discharges slowly, with time constants defined in CISPR 16, so that its reading rises with the repetition rate of impulsive interference. It was designed to weight interference by how annoying it was to analog radio and television listeners: rare clicks are less objectionable than a steady buzz. For a continuous sine wave, all three detectors read the same. For impulses at a low repetition rate, the quasi-peak reads well below the peak and the average even lower. Because peak is never lower than quasi-peak, labs scan with the peak detector and re-measure only the frequencies near the limit with quasi-peak.</w:t>
-      </w:r>
-    </w:p>
-    <w:p>
-      <w:pPr/>
-      <w:r>
-        <w:rPr>
-          <w:b/>
-        </w:rPr>
-        <w:t xml:space="preserve">Key idea. </w:t>
-      </w:r>
-      <w:r>
-        <w:rPr>
-          <w:i w:val="0"/>
-        </w:rPr>
-        <w:t>A field strength is meaningless without its detector and bandwidth. Continuous harmonics read the same on all detectors; impulsive and spread signals read lower on quasi-peak and average, which is why both the scan and the final measurement must use CISPR's settings.</w:t>
+        <w:t>A peak scan is often used to find candidate frequencies quickly, followed by measurements with the detector required by the product standard. Under FCC Section 15.35, peak measurement at the same bandwidth may be used as an alternative to quasi-peak below 1 GHz where that provision applies. That FCC option does not automatically replace a CISPR product standard's prescribed detector. The report must state what was measured and under which rule.</w:t>
+      </w:r>
+    </w:p>
+    <w:p>
+      <w:pPr/>
+      <w:r>
+        <w:rPr>
+          <w:b/>
+        </w:rPr>
+        <w:t xml:space="preserve">Key </w:t>
+      </w:r>
+      <w:r>
+        <w:rPr>
+          <w:b w:val="0"/>
+        </w:rPr>
+        <w:t>idea. A field-strength result is incomplete without its detector, bandwidth, dwell, and governing standard. Continuous signals may read similarly on different detectors; impulsive signals can differ substantially. A peak pre-scan helps locate candidates, but the final detector is selected from the applicable standard, including any explicit alternative it permits.</w:t>
       </w:r>
     </w:p>
     <w:p>
@@ -17906,7 +17893,7 @@
         <w:rPr>
           <w:i w:val="0"/>
         </w:rPr>
-        <w:t>Many emissions are not steady. A radio that transmits in bursts, a motor drive that runs intermittently, or a processor whose activity varies produces a signal that is on for a fraction of the time. The peak detector reads the level during the burst; the average detector reads the level averaged over time, which for a signal on for a fraction d of the time is lower by 20 log₁₀(1/d) decibels when the detector averages the voltage envelope, as CISPR average detectors do. The FCC's peak limit above 1 GHz, 20 dB above the average limit, Section 23.5, corresponds exactly to a duty cycle of 10 %: an emission on for less than a tenth of the time is constrained by the peak limit, and one on for more by the average limit. Labs must be told the duty cycle of any bursting source, because a scan that happens to miss bursts underreports both readings.</w:t>
+        <w:t>Many emissions are not steady. A radio transmitting in bursts, an intermittent motor drive, or a processor with varying activity produces a signal present for only part of the observation time. For an ideal rectangular voltage envelope with duty factor d, the time-average envelope is d times the burst amplitude, a reduction of 20 log10(1/d) dB. This is a teaching estimate, not a substitute for the detector response, dwell, pulse-weighting rules, or measurement procedure required by the applicable standard. FCC peak and average limits above 1 GHz are separate compliance limits; their 20 dB separation does not create a universal duty-cycle pass rule. A scan that misses bursts can under-report them, so the operating mode and measurement timing must be documented.</w:t>
       </w:r>
     </w:p>
     <w:p>
@@ -18522,13 +18509,10 @@
     <w:p>
       <w:pPr/>
       <w:r>
-        <w:t>Above 1 GHz, floor reflections create deep nulls that shift with small changes in height. CISPR 16-1-4 therefore uses a free-space environment: floor absorber between the antenna and product turns a semi-anechoic chamber into a fully anechoic one. Validate the site using its voltage standing-wave ratio, S_VSWR, which must not exceed 6 dB across the test volume.</w:t>
-      </w:r>
-    </w:p>
-    <w:p>
-      <w:pPr/>
-      <w:r>
-        <w:t>Use a horn as the receive antenna and make sure its beam covers the product. At distance d, a horn with beamwidth angle beta illuminates a width w = 2d tan(beta/2). Because the beam narrows as frequency rises, a product covered at 1 GHz may extend beyond it at 6 GHz; the standard then requires a height scan to find the maximum. The horn far field, 2D^2/lambda, must also fit inside the test distance. For a 0.2 m aperture at 6 GHz, 2 x 0.2^2 / 0.05 = 1.6 m, within a 3 m test distance.</w:t>
+        <w:rPr>
+          <w:i w:val="0"/>
+        </w:rPr>
+        <w:t>Above 1 GHz the reflecting floor stops being an advantage. The ground-reflected ray produces deep nulls that move with small changes in height, and CISPR 16-1-4 therefore requires a free-space test environment: absorber is laid on the floor between the antenna and the product, turning the semi-anechoic chamber into a fully anechoic one for these frequencies. The site is validated by a site voltage standing-wave ratio measurement, S_VSWR, which must not exceed 6 dB across the test volume. The receive antenna is now a horn, and its beam must cover the product. At distance d, a horn with a 3 dB beamwidth θ illuminates a width w = 2d tan(θ/2). Horn beamwidth narrows as frequency rises, so a product that is fully covered at 1 GHz may extend outside the beam at 6 GHz, and the standard then requires the antenna to be scanned in height to find the maximum. The horn's own far field, 2D²/λ, must also lie inside the test distance: a horn with a 0.2 m aperture at 6 GHz has 2 × 0.04 / 0.05 = 1.6 m, comfortably less than 3 m.</w:t>
       </w:r>
     </w:p>
     <w:p>
@@ -18590,6 +18574,9 @@
           <w:i w:val="0"/>
         </w:rPr>
         <w:t>The chamber measures what the product radiates. Chapter 26 measures what it pushes back into the mains, with a quite different instrument, the LISN.</w:t>
+      </w:r>
+      <w:r>
+        <w:t xml:space="preserve"> The room is deliberately uninteresting, at considerable expense.</w:t>
       </w:r>
     </w:p>
     <w:p>
@@ -18833,7 +18820,7 @@
         <w:spacing w:after="160"/>
       </w:pPr>
       <w:r>
-        <w:t xml:space="preserve">Below 30 MHz a product's own structure is too small to radiate much, so its interference travels another way: out through the power cord into the building's wiring, which radiates for it. The test measures the voltage on the cord, and a few millivolts too many fails it.</w:t>
+        <w:t>Below 30 MHz, conducted emissions on a mains lead are often the dominant compliance concern, though cables and structures can also radiate. The test measures disturbance voltage using a defined network and procedure; a few millivolts can matter, depending on frequency, detector, and limit.</w:t>
       </w:r>
     </w:p>
     <w:p>
@@ -18947,9 +18934,9 @@
       </w:r>
       <w:r>
         <w:rPr>
-          <w:i w:val="0"/>
-        </w:rPr>
-        <w:t>I = C dv/dt = 20 pF × 400 V/20 ns = 0.40 A during each edge. Across 25 Ω that is a 10 V spike, enormous compared with a 56 dBµV limit, which is only 0.63 mV. The cure starts at the source, with an insulating thermal pad of low capacitance or a shield layer tied to the primary return, before the filter is designed.</w:t>
+          <w:b w:val="0"/>
+        </w:rPr>
+        <w:t>The ideal displacement-current estimate is I = C dv/dt = 20 pF x 400 V/20 ns = 0.40 A during the edge. Multiplying by the LISN's 25 ohm common-mode equivalent gives 10 V only in this simplified lumped model. It is not a predicted CISPR receiver reading: the real edge spectrum, coupling path, parasitics, LISN network, receiver bandwidth, and detector all matter. Do not compare this transient peak directly with a conducted-emissions limit. The calculation identifies a mechanism worth investigating; it does not certify a failure or a pass. The calculator, as ever, has not been appointed the receiver.</w:t>
       </w:r>
     </w:p>
     <w:p>
@@ -19120,19 +19107,16 @@
         <w:pStyle w:val="Heading2"/>
       </w:pPr>
       <w:r>
-        <w:rPr>
-          <w:i w:val="0"/>
-        </w:rPr>
-        <w:t>26.5 The touch-current budget for Y capacitors</w:t>
-      </w:r>
-    </w:p>
-    <w:p>
-      <w:pPr/>
-      <w:r>
-        <w:rPr>
-          <w:i w:val="0"/>
-        </w:rPr>
-        <w:t>A Y capacitor from line to protective earth carries a mains-frequency current I = 2πfCV at all times. In normal use that current returns harmlessly through the earth conductor, but if the earth connection is broken, or the product is double insulated and has no earth, the same current flows through anyone who touches the chassis. Safety standards therefore cap the touch current. The older IEC 60950-1 limited Class II equipment to 0.25 mA, and IEC 62368-1 sets the boundary of energy class ES1 at 0.5 mA rms; medical standards are stricter still. The calculation must use the worst case: the highest rated mains voltage, the highest frequency, 60 Hz rather than 50 Hz, and the capacitor's upper tolerance. That budget fixes the largest total Y capacitance the filter may use, and when it is not enough for the common-mode attenuation, the remaining attenuation must come from the common-mode choke, which has no such limit.</w:t>
+        <w:t>26.5 Y-capacitor current estimates and safety limits</w:t>
+      </w:r>
+    </w:p>
+    <w:p>
+      <w:pPr/>
+      <w:r>
+        <w:rPr>
+          <w:i w:val="0"/>
+        </w:rPr>
+        <w:t>A Y capacitor connected across an isolation boundary can contribute to touch current. For a sinusoidal source and ideal capacitor, I = 2 pi f C V estimates the current magnitude; it is a screening calculation, not a safety measurement. Do not infer a universal permissible current from the ES1 energy-source class in IEC 62368-1 or carry limits over from withdrawn IEC 60950-1. The applicable product standard, equipment class, protective-earth arrangement, normal and single-fault conditions, frequency weighting, and prescribed measuring network determine the limit and test. IEC 60990:2016 describes touch-current measurement methods but explicitly does not set limit values. Use the applicable adopted edition and have the safety design reviewed before fixing Y-capacitance. The choke can supply additional common-mode attenuation, but it does not remove the need to verify touch current.</w:t>
       </w:r>
     </w:p>
     <w:p>
@@ -19167,9 +19151,9 @@
       </w:r>
       <w:r>
         <w:rPr>
-          <w:i w:val="0"/>
-        </w:rPr>
-        <w:t>Find the touch current of a 4.7 nF Y capacitor at 230 V, 50 Hz, and at the worst case of 264 V, 60 Hz. What is the largest Y capacitance that keeps the touch current below 0.25 mA at 264 V, 60 Hz?</w:t>
+          <w:b w:val="0"/>
+        </w:rPr>
+        <w:t>Estimate the ideal sinusoidal current through a 4.7 nF capacitor at 230 V, 50 Hz, and at 264 V, 60 Hz. For a purely mathematical exercise, what capacitance corresponds to 0.25 mA under the latter assumptions? This chosen number is not a universal regulatory limit.</w:t>
       </w:r>
     </w:p>
     <w:p>
@@ -19182,9 +19166,9 @@
       </w:r>
       <w:r>
         <w:rPr>
-          <w:i w:val="0"/>
-        </w:rPr>
-        <w:t xml:space="preserve">At 230 V, 50 Hz, I = 2π × 50 × 4.7 nF × 230 V = 0.34 mA. At 264 V, 60 Hz, I = 2π × 60 × 4.7 nF × 264 V = 0.47 mA, above 0.25 mA. The largest capacitance is C = 0.25 mA / (2π × 60 × 264 V) = 2.5 nF, so a 2.2 nF part, which stays below 2.5 nF even at +10 % tolerance, is the practical choice, and the choke must supply the attenuation the smaller capacitor gives up.</w:t>
+          <w:b w:val="0"/>
+        </w:rPr>
+        <w:t>At 230 V, 50 Hz, the ideal estimate is I = 2 pi x 50 x 4.7 nF x 230 V = 0.34 mA. At 264 V, 60 Hz, it is 0.47 mA. Solving the exercise's assumed 0.25 mA value gives C = 0.25 mA / (2 pi x 60 x 264 V) = 2.5 nF. These figures ignore the prescribed touch-current measuring network, waveform, fault configuration, and component tolerances; they cannot establish product compliance or select a safe component by themselves.</w:t>
       </w:r>
     </w:p>
     <w:p>
@@ -19201,10 +19185,7 @@
     <w:p>
       <w:pPr/>
       <w:r>
-        <w:rPr>
-          <w:i w:val="0"/>
-        </w:rPr>
-        <w:t>Once the touch-current budget has fixed the Y capacitance, the common-mode choke supplies the rest of the common-mode attenuation. For common-mode noise the two Y capacitors act in parallel, from both lines together to earth, and the choke's common-mode inductance forms a second-order low-pass filter with them, falling at 40 dB per decade above its corner. The choke is wound so that the line and neutral currents, equal and opposite, cancel their flux in the core, which keeps the large mains current from saturating it, while common-mode current, flowing the same way in both windings, sees the full inductance. High-permeability ferrite cores give millihenries in a small part, but their permeability and therefore their inductance fall at high frequency, and the inter-winding capacitance of the choke eventually bypasses it, which is why the highest-frequency conducted problems often need a second, smaller choke.</w:t>
+        <w:t>Once the applicable safety review has established which Y-capacitance values are permitted, the common-mode choke can supply the remaining common-mode attenuation. For an ideal common-mode model the two capacitors act in parallel, from both lines together to earth, and the choke’s common-mode inductance forms a second-order low-pass filter with them, falling at 40 dB per decade above its corner. The choke is wound so that line and neutral currents, equal and opposite, cancel their flux in the core, while common-mode current flowing the same way in both windings sees the full inductance. High-permeability ferrite cores can provide millihenries in a small part, but permeability and inductance fall at high frequency, and inter-winding capacitance eventually bypasses the choke. Practical filters therefore need measured insertion loss and attention to damping and parasitics.</w:t>
       </w:r>
     </w:p>
     <w:p>
@@ -19239,30 +19220,15 @@
       </w:r>
       <w:r>
         <w:rPr>
-          <w:i w:val="0"/>
-        </w:rPr>
-        <w:t>The filter uses two 2.2 nF Y capacitors, the largest allowed by the touch-current budget of Worked Example 26.3. Find the common-mode choke inductance that puts the filter corner at 50 kHz, and the attenuation that corner gives at 500 kHz.</w:t>
-      </w:r>
-    </w:p>
-    <w:p>
-      <w:pPr/>
-      <w:r>
-        <w:rPr>
-          <w:b/>
-        </w:rPr>
-        <w:t>Solution.</w:t>
-      </w:r>
-      <w:r>
-        <w:rPr>
           <w:b w:val="0"/>
         </w:rPr>
-        <w:t xml:space="preserve"> Either Y capacitor alone may end up across the live conductor, so the touch-current budget applies to each one. For common-mode noise the two act in parallel, 4.4 nF.</w:t>
-      </w:r>
-      <w:r>
-        <w:rPr>
-          <w:i w:val="0"/>
-        </w:rPr>
-        <w:t xml:space="preserve"> L = 1/((2π × 50 × 10³)² × 4.4 × 10⁻⁹) = 1/(9.87 × 10¹⁰ × 4.4 × 10⁻⁹) = 2.3 mH. At 500 kHz, a decade above the corner, the second-order filter gives about 40 dB.</w:t>
+        <w:t>For an idealized common-mode filter model, use two 2.2 nF capacitors in parallel and target a 50 kHz corner. Find the required inductance and the ideal second-order attenuation at 500 kHz. Treat these capacitances as model inputs only; the calculation does not show that they are allowed or safe in a product.</w:t>
+      </w:r>
+    </w:p>
+    <w:p>
+      <w:pPr/>
+      <w:r>
+        <w:t>Solution. In the ideal filter model, the two capacitances sum to 4.4 nF. L = 1/((2 pi x 50 x 10^3)^2 x 4.4 x 10^-9) = 2.3 mH. At 500 kHz, one decade above the corner, an ideal second-order filter gives about 40 dB attenuation. This ignores source and load impedance, component loss, choke parasitics, layout, and the actual line/earth topology; measure the assembled filter and assess safety separately.</w:t>
       </w:r>
     </w:p>
     <w:p>
@@ -19306,9 +19272,9 @@
       </w:r>
       <w:r>
         <w:rPr>
-          <w:i w:val="0"/>
-        </w:rPr>
-        <w:t xml:space="preserve">A battery-powered EEG headband for a brain-computer-interface project streams to a mains-powered laptop through an isolated USB link. Its isolated DC-DC converter has 10 pF across the barrier and its digital isolator 2 pF. Find the current through the barrier with 264 V, 60 Hz on the laptop side, the worst case of a single fault, and compare it with the patient-leakage limits of IEC 60601-1.</w:t>
+          <w:b w:val="0"/>
+        </w:rPr>
+        <w:t>In an idealized model, an EEG headband's isolated DC-DC converter contributes 10 pF and its digital isolator 2 pF across a barrier. Estimate the 60 Hz displacement current for 264 V across 12 pF. Explain why this calculation cannot establish patient-current compliance under IEC 60601-1.</w:t>
       </w:r>
     </w:p>
     <w:p>
@@ -19321,9 +19287,9 @@
       </w:r>
       <w:r>
         <w:rPr>
-          <w:i w:val="0"/>
-        </w:rPr>
-        <w:t xml:space="preserve">The barrier totals 12 pF, so I = 2π × 60 × 12 × 10⁻¹² × 264 = 1.19 µA. IEC 60601-1 allows a type BF applied part, one that touches the body but not the heart, 100 µA of patient leakage in normal condition and 500 µA in single fault, and a type CF part 10 and 50 µA. The capacitive leakage is far inside even the CF limits. Leakage is not the whole requirement, though: a medical device needs two means of patient protection across the barrier, which at 250 V means a 4000 V rms test and about 8 mm of creepage, and only a certified design meets that. The same small capacitance also keeps mains hum off the electrodes, whose signals are tens of microvolts.</w:t>
+          <w:b w:val="0"/>
+        </w:rPr>
+        <w:t>The ideal sinusoidal estimate is I = 2 pi x 60 x 12 pF x 264 V = 1.19 uA. That value is not a patient-leakage test result and cannot be compared directly with an IEC 60601-1 limit. Patient-current measurements use prescribed networks and operating/fault configurations; the allowed value depends on the applied-part classification and relevant clauses. Means of patient protection, insulation tests, creepage, and clearance depend on the design and applicable collateral or particular standards. No single voltage or distance follows from this capacitance calculation. This example illustrates coupling only; it does not establish that a circuit is safe to connect to a person.</w:t>
       </w:r>
     </w:p>
     <w:p>
@@ -19957,7 +19923,10 @@
     <w:p>
       <w:pPr/>
       <w:r>
-        <w:t>IEC 61000-4-5 applies signal and data line surges through a larger impedance than mains surges. For an unshielded line, the test adds 40 ohms to the generator's 2-ohm source impedance. This limits current relative to mains testing, but low-voltage signal pins remain vulnerable. Above breakdown voltage V_BR, a TVS behaves approximately like V_BR in series with its dynamic resistance R_dyn. At surge current I_PP, the protected pin sees V_C = V_BR + I_PP * R_dyn, not V_BR alone. A suitable TVS must pass four checks: its stand-off voltage must exceed the line's highest normal voltage; its clamping voltage must stay below the protected part's absolute maximum at the test current; its 8/20 us peak-pulse rating must exceed V_C * I_PP; and, on multi-gigabit lines, its capacitance must be low enough to avoid loading the signal, often a fraction of a picofarad.</w:t>
+        <w:rPr>
+          <w:i w:val="0"/>
+        </w:rPr>
+        <w:t>Surges on signal and data lines are applied through a larger coupling impedance than on mains lines. For unshielded lines IEC 61000-4-5 adds 40 Ω to the generator's 2 Ω, so the current is far smaller than on a power input, but the protected circuit is also far more fragile. A TVS diode conducts above its breakdown voltage V_BR and behaves, once conducting, roughly like a voltage source V_BR in series with a dynamic resistance R_dyn. The clamping voltage is then V_C = V_BR + I_PP R_dyn, and that voltage, not the breakdown voltage, is what the protected pin sees. Choosing a TVS means meeting four conditions at once: its stand-off voltage must exceed the line's highest working voltage so it does not leak in normal use; its clamping voltage at the surge current must stay below the protected part's absolute maximum; its peak pulse power rating for an 8/20 µs pulse must exceed V_C × I_PP; and its capacitance must be small enough not to load the signal, which for multi-gigabit lines means a fraction of a picofarad and a different class of device.</w:t>
       </w:r>
     </w:p>
     <w:p>
@@ -20089,9 +20058,9 @@
       </w:r>
       <w:r>
         <w:rPr>
-          <w:i w:val="0"/>
-        </w:rPr>
-        <w:t>The series' smart thermostat has a USB-C service port at 5 V and a ESP32-S3 Wi-Fi radio module with an FCC grant, installed under the grant's conditions. A TVS on VBUS has V_BR = 6.0 V and R_dyn = 0.3 Ω (example figures). Find its clamping voltage at the first peak of an 8 kV contact discharge, say what the USB 2.0 data lines need, and list what the module's grant does not cover.</w:t>
+          <w:b w:val="0"/>
+        </w:rPr>
+        <w:t>The series' smart thermostat has a USB-C service port at 5 V and an ESP32-S3 Wi-Fi radio module with an FCC grant, installed under the grant's conditions. A TVS on VBUS has V_BR = 6.0 V and R_dyn = 0.3 Ω (example figures). Find its clamping voltage at the first peak of an 8 kV contact discharge, say what the USB 2.0 data lines need, and list what the module's grant does not cover.</w:t>
       </w:r>
     </w:p>
     <w:p>
@@ -21170,7 +21139,10 @@
     <w:p>
       <w:pPr/>
       <w:r>
-        <w:t>A mobile robot, and in 2026 particularly the humanoid and the mobile manipulator, is one product that draws on all nine books. Book 1 supplies the foundations; Book 2, circuits and control; Book 3, device behavior; Book 4, RF hardware; Book 5, communications; Book 6, power and energy; this book, packaging, layout, and EMC; Book 8, firmware; and Book 9, measurement. A robot uses them together: its battery feeds motor converters, feedback loops stabilize its joints, MEMS sensors report motion, radios carry data, and the package must keep heat and switching noise from disrupting the computer. This chapter focuses on those boundaries rather than repeating each volume's full treatment. It uses a few numbers to show how the subjects meet.</w:t>
+        <w:rPr>
+          <w:b w:val="0"/>
+        </w:rPr>
+        <w:t>A mobile robot, and in 2026 particularly the humanoid and the mobile manipulator, is one product that draws on all nine books. Book 1 supplies the foundations; Book 2, circuits and control; Book 3, device behavior; Book 4, RF hardware; Book 5, communications; Book 6, power and energy; this book, packaging, layout, and EMC; Book 8, firmware; and Book 9, measurement. A robot uses them together: its battery feeds motor converters, feedback loops stabilize its joints, MEMS sensors report motion, radios carry data, and the package must keep heat and switching noise from disrupting the computer. This chapter focuses on those boundaries rather than repeating each volume's full treatment. It uses a few numbers to show how the subjects meet. The robot here is a worked design thread, not a report of a tested prototype: each number is an assumption to check against a chosen motor, board, enclosure, and test plan.</w:t>
       </w:r>
     </w:p>
     <w:p>
@@ -23595,9 +23567,9 @@
       </w:r>
       <w:r>
         <w:rPr>
-          <w:b w:val="0"/>
-        </w:rPr>
-        <w:t>With the dielectric constant and other dimensions fixed, a wider trace increases 0.8w + t in the formula's denominator. That reduces the logarithm and the estimated characteristic impedance.</w:t>
+          <w:i w:val="0"/>
+        </w:rPr>
+        <w:t>It falls.</w:t>
       </w:r>
     </w:p>
     <w:p>
@@ -25430,7 +25402,7 @@
         <w:rPr>
           <w:i w:val="0"/>
         </w:rPr>
-        <w:t>The prospective short-circuit peak is I = 4000 V / 2 ohms = 2000 A. This is the generator current into a short at the stated line-to-line source impedance, not the current a protected product necessarily conducts during a surge.</w:t>
+        <w:t xml:space="preserve">I = 4000/2 = 2000 A.</w:t>
       </w:r>
     </w:p>
     <w:p>
@@ -25692,7 +25664,7 @@
         <w:rPr>
           <w:i w:val="0"/>
         </w:rPr>
-        <w:t>The ideal arithmetic runtime is 1500 Wh / 375 W = 4 hours. This assumes the full stated capacity is usable and the average load stays constant; reserve, cutoff, conversion loss, temperature, and aging reduce actual runtime.</w:t>
+        <w:t xml:space="preserve">1500 Wh/375 W = 4 hours.</w:t>
       </w:r>
     </w:p>
     <w:p>
@@ -26099,25 +26071,25 @@
         <w:rPr>
           <w:i w:val="0"/>
         </w:rPr>
-        <w:t>CISPR 16-1-1, 16-1-4, 16-2-3, and 16-4-2, for receivers, antennas and sites, radiated measurement, and uncertainty; ANSI C63.4-2014, for the US method (Chapters 23 to 25).</w:t>
-      </w:r>
-    </w:p>
-    <w:p>
-      <w:pPr/>
-      <w:r>
-        <w:rPr>
-          <w:i w:val="0"/>
-        </w:rPr>
-        <w:t>CISPR 32 (multimedia equipment emissions), CISPR 35 (immunity), and 47 CFR Part 15 Subpart B, for the limits (Chapters 23, 24, 26, and 27).</w:t>
-      </w:r>
-    </w:p>
-    <w:p>
-      <w:pPr/>
-      <w:r>
-        <w:rPr>
-          <w:i w:val="0"/>
-        </w:rPr>
-        <w:t>IEC 61000-4-2, -4-3, -4-4, -4-5, and -4-6, for the immunity tests (Chapter 27); ETSI EN 301 489 and the Radio Equipment Directive 2014/53/EU, for the radio side. FCC OET KDB Publication 996369, including D04 Module Integration Guide, for modular-transmitter conditions and host-product responsibilities (Chapter 27): https://apps.fcc.gov/oetcf/kdb/forms/FTSSearchResultPage.cfm?id=44637&amp;switch=P.</w:t>
+        <w:t>CISPR 16-1-1:2019; CISPR 16-1-2:2014+A1:2017; CISPR 16-1-4:2025; CISPR 16-2-1:2014+A1:2017; CISPR 16-2-3:2016+A1:2019+A2:2023; CISPR 16-4-2:2011+A1:2014+A2:2018; and ANSI/IEEE C63.4-2014 (reaffirmed 2025) with C63.4a-2017, for receiver, coupling-device, site, method, and uncertainty references in Chapters 23 to 25. Verify the edition adopted in the target market. IEC catalogue: https://webstore.iec.ch/ ; IEEE Standards: https://standards.ieee.org/standard/C63_4-2014.html</w:t>
+      </w:r>
+    </w:p>
+    <w:p>
+      <w:pPr/>
+      <w:r>
+        <w:rPr>
+          <w:i w:val="0"/>
+        </w:rPr>
+        <w:t>CISPR 32:2015+A1:2019 (Edition 2.1, multimedia emissions), CISPR 35:2016 (immunity), and 47 CFR Part 15 Subpart B (US unintentional-radiator limits), for Chapters 23, 24, 26, and 27. FCC rules: https://www.ecfr.gov/current/title-47/chapter-I/subchapter-A/part-15</w:t>
+      </w:r>
+    </w:p>
+    <w:p>
+      <w:pPr/>
+      <w:r>
+        <w:rPr>
+          <w:i w:val="0"/>
+        </w:rPr>
+        <w:t>IEC 61000-4-2:2025 (Edition 3), IEC 61000-4-3:2020 (Edition 4), IEC 61000-4-4:2012 (Edition 3), IEC 61000-4-5:2014+A1:2017 (Edition 3.1), and IEC 61000-4-6:2023 (Edition 5), for the immunity-test methods in Chapter 27. Product standards choose the test levels and performance criteria. IEC catalogue: https://webstore.iec.ch/</w:t>
       </w:r>
     </w:p>
     <w:p>
@@ -26183,18 +26155,18 @@
       <w:pPr/>
       <w:r>
         <w:rPr>
-          <w:i w:val="0"/>
-        </w:rPr>
-        <w:t>CISPR 16-4-3 and CISPR 32 Annex material on the 80/80 statistical assessment of series production (Chapter 28); FCC 47 CFR 15.33 and 15.35 for the upper scan frequency and the peak and average limits above 1 GHz (Chapters 23 and 24).</w:t>
-      </w:r>
-    </w:p>
-    <w:p>
-      <w:pPr/>
-      <w:r>
-        <w:rPr>
-          <w:i w:val="0"/>
-        </w:rPr>
-        <w:t>IEC 62368-1 and IEC 60950-1 for touch-current limits (Chapter 26); Littelfuse and Semtech TVS application notes for surge protection of signal lines (Chapter 27).</w:t>
+          <w:b w:val="0"/>
+        </w:rPr>
+        <w:t>CISPR TR 16-4-3:2004+A1:2006 (Edition 2.1) and CISPR 32:2015+A1:2019 Annex material on the 80/80 statistical assessment of series production (Chapter 28); FCC 47 CFR 15.33 and 15.35 for the upper scan frequency and the peak and average limits above 1 GHz (Chapters 23 and 24).</w:t>
+      </w:r>
+    </w:p>
+    <w:p>
+      <w:pPr/>
+      <w:r>
+        <w:rPr>
+          <w:i w:val="0"/>
+        </w:rPr>
+        <w:t>IEC 62368-1:2023 (Edition 4) for audio/video and ICT safety; IEC 60990:2016 (Edition 3) for touch-current measurement methods, which do not themselves set limits; IEC 60601-1:2005+A1:2012+A2:2020 (Edition 3.2) for medical electrical equipment; and IEC 60664-1:2020+A1:2025 (Edition 3.1) for insulation coordination (Chapter 26). Applicability and adopted editions vary by product and market. IEC catalogue: https://webstore.iec.ch/</w:t>
       </w:r>
     </w:p>
     <w:p>
@@ -26242,37 +26214,13 @@
     </w:p>
     <w:p>
       <w:pPr/>
-      <w:hyperlink r:id="rIdL17" w:history="1">
-        <w:r>
-          <w:rPr>
-            <w:i w:val="0"/>
-            <w:color w:val="0563C1"/>
-            <w:u w:val="single"/>
-          </w:rPr>
-          <w:t>IEC 60825-1:2014</w:t>
-        </w:r>
-      </w:hyperlink>
-      <w:r>
-        <w:rPr>
-          <w:i w:val="0"/>
-        </w:rPr>
-        <w:t xml:space="preserve"> (laser product safety) and STMicroelectronics VL53L1X data sheet, for Section 15.7; IEC 60664-1 (insulation coordination), IEC 60601-1 (medical electrical equipment), and the Sharp PC817 data sheet, for Chapter 26; NXP </w:t>
-      </w:r>
-      <w:hyperlink r:id="rIdL18" w:history="1">
-        <w:r>
-          <w:rPr>
-            <w:i w:val="0"/>
-            <w:color w:val="0563C1"/>
-            <w:u w:val="single"/>
-          </w:rPr>
-          <w:t>UM10204</w:t>
-        </w:r>
-      </w:hyperlink>
-      <w:r>
-        <w:rPr>
-          <w:i w:val="0"/>
-        </w:rPr>
-        <w:t xml:space="preserve"> (I²C-bus specification) and 47 CFR 15.23, for Chapters 21 and 27.</w:t>
+      <w:r>
+        <w:t>IEC 60825-1:2014 (Edition 3; laser product safety) and the STMicroelectronics VL53L1X data sheet for Section 15.7; NXP UM10204 Rev. 7.0 (I2C-bus specification) and 47 CFR 15.23 for Chapters 21 and 27. See the Chapter 26 safety references above.</w:t>
+      </w:r>
+    </w:p>
+    <w:p>
+      <w:r>
+        <w:t>Standards change, and national adoptions can differ from the IEC publication. The editions below identify references checked for this revision; they do not claim every market has adopted them unchanged. Before design release or certification, verify the current product standard, national adoption, amendments, and laboratory procedure.</w:t>
       </w:r>
     </w:p>
     <w:p>

</xml_diff>